<commit_message>
atualização conforme reunião em 22-01-2026
</commit_message>
<xml_diff>
--- a/documentacao/Manual de Interoperabilidade de Documentos Arquivisticos.docx
+++ b/documentacao/Manual de Interoperabilidade de Documentos Arquivisticos.docx
@@ -35,6 +35,15 @@
     </w:p>
     <w:sdt>
       <w:sdtPr>
+        <w:rPr>
+          <w:rFonts w:asciiTheme="minorHAnsi" w:eastAsiaTheme="minorHAnsi" w:hAnsiTheme="minorHAnsi" w:cstheme="minorBidi"/>
+          <w:color w:val="auto"/>
+          <w:kern w:val="2"/>
+          <w:sz w:val="24"/>
+          <w:szCs w:val="24"/>
+          <w:lang w:eastAsia="en-US"/>
+          <w14:ligatures w14:val="standardContextual"/>
+        </w:rPr>
         <w:id w:val="-517702446"/>
         <w:docPartObj>
           <w:docPartGallery w:val="Table of Contents"/>
@@ -43,15 +52,8 @@
       </w:sdtPr>
       <w:sdtEndPr>
         <w:rPr>
-          <w:rFonts w:asciiTheme="minorHAnsi" w:eastAsiaTheme="minorHAnsi" w:hAnsiTheme="minorHAnsi" w:cstheme="minorBidi"/>
           <w:b/>
           <w:bCs/>
-          <w:color w:val="auto"/>
-          <w:kern w:val="2"/>
-          <w:sz w:val="24"/>
-          <w:szCs w:val="24"/>
-          <w:lang w:eastAsia="en-US"/>
-          <w14:ligatures w14:val="standardContextual"/>
         </w:rPr>
       </w:sdtEndPr>
       <w:sdtContent>
@@ -1963,7 +1965,7 @@
     <w:p>
       <w:r>
         <w:pict w14:anchorId="5A3343C1">
-          <v:rect id="_x0000_i1133" style="width:0;height:1.5pt" o:hralign="center" o:hrstd="t" o:hr="t" fillcolor="#a0a0a0" stroked="f"/>
+          <v:rect id="_x0000_i1025" style="width:0;height:1.5pt" o:hralign="center" o:hrstd="t" o:hr="t" fillcolor="#a0a0a0" stroked="f"/>
         </w:pict>
       </w:r>
     </w:p>
@@ -2158,7 +2160,7 @@
     <w:p>
       <w:r>
         <w:pict w14:anchorId="7BBB2724">
-          <v:rect id="_x0000_i1134" style="width:0;height:1.5pt" o:hralign="center" o:hrstd="t" o:hr="t" fillcolor="#a0a0a0" stroked="f"/>
+          <v:rect id="_x0000_i1026" style="width:0;height:1.5pt" o:hralign="center" o:hrstd="t" o:hr="t" fillcolor="#a0a0a0" stroked="f"/>
         </w:pict>
       </w:r>
     </w:p>
@@ -2290,7 +2292,7 @@
       <w:r>
         <w:lastRenderedPageBreak/>
         <w:pict w14:anchorId="55D97CB9">
-          <v:rect id="_x0000_i1135" style="width:0;height:1.5pt" o:hralign="center" o:hrstd="t" o:hr="t" fillcolor="#a0a0a0" stroked="f"/>
+          <v:rect id="_x0000_i1027" style="width:0;height:1.5pt" o:hralign="center" o:hrstd="t" o:hr="t" fillcolor="#a0a0a0" stroked="f"/>
         </w:pict>
       </w:r>
     </w:p>
@@ -2372,7 +2374,7 @@
     <w:p>
       <w:r>
         <w:pict w14:anchorId="1392ADBC">
-          <v:rect id="_x0000_i1136" style="width:0;height:1.5pt" o:hralign="center" o:hrstd="t" o:hr="t" fillcolor="#a0a0a0" stroked="f"/>
+          <v:rect id="_x0000_i1028" style="width:0;height:1.5pt" o:hralign="center" o:hrstd="t" o:hr="t" fillcolor="#a0a0a0" stroked="f"/>
         </w:pict>
       </w:r>
     </w:p>
@@ -2625,7 +2627,7 @@
     <w:p>
       <w:r>
         <w:pict w14:anchorId="7D1FC7AE">
-          <v:rect id="_x0000_i1137" style="width:0;height:1.5pt" o:hralign="center" o:hrstd="t" o:hr="t" fillcolor="#a0a0a0" stroked="f"/>
+          <v:rect id="_x0000_i1029" style="width:0;height:1.5pt" o:hralign="center" o:hrstd="t" o:hr="t" fillcolor="#a0a0a0" stroked="f"/>
         </w:pict>
       </w:r>
     </w:p>
@@ -3092,7 +3094,7 @@
     <w:p>
       <w:r>
         <w:pict w14:anchorId="473C5BDE">
-          <v:rect id="_x0000_i1138" style="width:0;height:1.5pt" o:hralign="center" o:hrstd="t" o:hr="t" fillcolor="#a0a0a0" stroked="f"/>
+          <v:rect id="_x0000_i1030" style="width:0;height:1.5pt" o:hralign="center" o:hrstd="t" o:hr="t" fillcolor="#a0a0a0" stroked="f"/>
         </w:pict>
       </w:r>
     </w:p>
@@ -4087,7 +4089,7 @@
     <w:p>
       <w:r>
         <w:pict w14:anchorId="719D1EA6">
-          <v:rect id="_x0000_i1139" style="width:0;height:1.5pt" o:hralign="center" o:hrstd="t" o:hr="t" fillcolor="#a0a0a0" stroked="f"/>
+          <v:rect id="_x0000_i1031" style="width:0;height:1.5pt" o:hralign="center" o:hrstd="t" o:hr="t" fillcolor="#a0a0a0" stroked="f"/>
         </w:pict>
       </w:r>
     </w:p>
@@ -4659,7 +4661,7 @@
     <w:p>
       <w:r>
         <w:pict w14:anchorId="33ADBFB1">
-          <v:rect id="_x0000_i1140" style="width:0;height:1.5pt" o:hralign="center" o:hrstd="t" o:hr="t" fillcolor="#a0a0a0" stroked="f"/>
+          <v:rect id="_x0000_i1032" style="width:0;height:1.5pt" o:hralign="center" o:hrstd="t" o:hr="t" fillcolor="#a0a0a0" stroked="f"/>
         </w:pict>
       </w:r>
     </w:p>
@@ -4912,7 +4914,7 @@
     <w:p>
       <w:r>
         <w:pict w14:anchorId="2B9FA6AB">
-          <v:rect id="_x0000_i1141" style="width:0;height:1.5pt" o:hralign="center" o:hrstd="t" o:hr="t" fillcolor="#a0a0a0" stroked="f"/>
+          <v:rect id="_x0000_i1033" style="width:0;height:1.5pt" o:hralign="center" o:hrstd="t" o:hr="t" fillcolor="#a0a0a0" stroked="f"/>
         </w:pict>
       </w:r>
     </w:p>
@@ -4957,9 +4959,9 @@
       </w:tblPr>
       <w:tblGrid>
         <w:gridCol w:w="869"/>
-        <w:gridCol w:w="1426"/>
+        <w:gridCol w:w="894"/>
         <w:gridCol w:w="1294"/>
-        <w:gridCol w:w="3673"/>
+        <w:gridCol w:w="5447"/>
       </w:tblGrid>
       <w:tr>
         <w:trPr>
@@ -5103,7 +5105,48 @@
           </w:tcPr>
           <w:p>
             <w:r>
-              <w:t>URI | LOCALIZACAOFISICA</w:t>
+              <w:t>“</w:t>
+            </w:r>
+            <w:r>
+              <w:t>URI</w:t>
+            </w:r>
+            <w:r>
+              <w:t>” : Quando o arquivo ao qual o componente está associado se encontra em um endereço web</w:t>
+            </w:r>
+          </w:p>
+          <w:p>
+            <w:r>
+              <w:lastRenderedPageBreak/>
+              <w:t>“</w:t>
+            </w:r>
+            <w:r>
+              <w:t>LOCALIZACAO</w:t>
+            </w:r>
+            <w:r>
+              <w:t>EMDISCO</w:t>
+            </w:r>
+            <w:r>
+              <w:t xml:space="preserve">” : </w:t>
+            </w:r>
+            <w:r>
+              <w:t>Quando o arquivo ao qual o componente está associado</w:t>
+            </w:r>
+            <w:r>
+              <w:t xml:space="preserve"> se encontra em um </w:t>
+            </w:r>
+            <w:r>
+              <w:t>dispositivo de armazenamento.</w:t>
+            </w:r>
+          </w:p>
+          <w:p>
+            <w:r>
+              <w:t xml:space="preserve">“RELATIVA” Quando o documento está em um pacote para transmissão, </w:t>
+            </w:r>
+            <w:r>
+              <w:t>o arquivo ao qual o componente está associado</w:t>
+            </w:r>
+            <w:r>
+              <w:t xml:space="preserve"> ainda sim tem um endereço, só que este é relativo a pasta raiz do pacote.</w:t>
             </w:r>
           </w:p>
         </w:tc>
@@ -5166,7 +5209,7 @@
     <w:p>
       <w:r>
         <w:pict w14:anchorId="26C9BEE5">
-          <v:rect id="_x0000_i1142" style="width:0;height:1.5pt" o:hralign="center" o:hrstd="t" o:hr="t" fillcolor="#a0a0a0" stroked="f"/>
+          <v:rect id="_x0000_i1034" style="width:0;height:1.5pt" o:hralign="center" o:hrstd="t" o:hr="t" fillcolor="#a0a0a0" stroked="f"/>
         </w:pict>
       </w:r>
     </w:p>
@@ -5472,7 +5515,7 @@
     <w:p>
       <w:r>
         <w:pict w14:anchorId="24AD29B0">
-          <v:rect id="_x0000_i1143" style="width:0;height:1.5pt" o:hralign="center" o:hrstd="t" o:hr="t" fillcolor="#a0a0a0" stroked="f"/>
+          <v:rect id="_x0000_i1035" style="width:0;height:1.5pt" o:hralign="center" o:hrstd="t" o:hr="t" fillcolor="#a0a0a0" stroked="f"/>
         </w:pict>
       </w:r>
     </w:p>
@@ -5724,8 +5767,9 @@
     </w:tbl>
     <w:p>
       <w:r>
+        <w:lastRenderedPageBreak/>
         <w:pict w14:anchorId="22251E41">
-          <v:rect id="_x0000_i1144" style="width:0;height:1.5pt" o:hralign="center" o:hrstd="t" o:hr="t" fillcolor="#a0a0a0" stroked="f"/>
+          <v:rect id="_x0000_i1036" style="width:0;height:1.5pt" o:hralign="center" o:hrstd="t" o:hr="t" fillcolor="#a0a0a0" stroked="f"/>
         </w:pict>
       </w:r>
     </w:p>
@@ -5933,7 +5977,6 @@
           </w:tcPr>
           <w:p>
             <w:r>
-              <w:lastRenderedPageBreak/>
               <w:t>versao</w:t>
             </w:r>
           </w:p>
@@ -6032,7 +6075,7 @@
     <w:p>
       <w:r>
         <w:pict w14:anchorId="05066AE0">
-          <v:rect id="_x0000_i1145" style="width:0;height:1.5pt" o:hralign="center" o:hrstd="t" o:hr="t" fillcolor="#a0a0a0" stroked="f"/>
+          <v:rect id="_x0000_i1037" style="width:0;height:1.5pt" o:hralign="center" o:hrstd="t" o:hr="t" fillcolor="#a0a0a0" stroked="f"/>
         </w:pict>
       </w:r>
     </w:p>
@@ -6338,7 +6381,7 @@
     <w:p>
       <w:r>
         <w:pict w14:anchorId="623EBCE2">
-          <v:rect id="_x0000_i1146" style="width:0;height:1.5pt" o:hralign="center" o:hrstd="t" o:hr="t" fillcolor="#a0a0a0" stroked="f"/>
+          <v:rect id="_x0000_i1038" style="width:0;height:1.5pt" o:hralign="center" o:hrstd="t" o:hr="t" fillcolor="#a0a0a0" stroked="f"/>
         </w:pict>
       </w:r>
     </w:p>
@@ -6591,7 +6634,7 @@
     <w:p>
       <w:r>
         <w:pict w14:anchorId="1BE11C12">
-          <v:rect id="_x0000_i1147" style="width:0;height:1.5pt" o:hralign="center" o:hrstd="t" o:hr="t" fillcolor="#a0a0a0" stroked="f"/>
+          <v:rect id="_x0000_i1039" style="width:0;height:1.5pt" o:hralign="center" o:hrstd="t" o:hr="t" fillcolor="#a0a0a0" stroked="f"/>
         </w:pict>
       </w:r>
     </w:p>
@@ -6659,6 +6702,7 @@
                 <w:b/>
                 <w:bCs/>
               </w:rPr>
+              <w:lastRenderedPageBreak/>
               <w:t>Campo</w:t>
             </w:r>
           </w:p>
@@ -6808,11 +6852,7 @@
           </w:tcPr>
           <w:p>
             <w:r>
-              <w:t xml:space="preserve">Identificador do </w:t>
-            </w:r>
-            <w:r>
-              <w:lastRenderedPageBreak/>
-              <w:t>componente.</w:t>
+              <w:t>Identificador do componente.</w:t>
             </w:r>
           </w:p>
         </w:tc>
@@ -7063,8 +7103,16 @@
             <w:hideMark/>
           </w:tcPr>
           <w:p>
+            <w:pPr>
+              <w:rPr>
+                <w:u w:val="single"/>
+              </w:rPr>
+            </w:pPr>
             <w:r>
               <w:t>Software de criação.</w:t>
+            </w:r>
+            <w:r>
+              <w:t xml:space="preserve"> Metadado Desejável.</w:t>
             </w:r>
           </w:p>
         </w:tc>
@@ -7207,6 +7255,7 @@
           </w:tcPr>
           <w:p>
             <w:r>
+              <w:lastRenderedPageBreak/>
               <w:t>earqComponenteInibidor</w:t>
             </w:r>
           </w:p>
@@ -7264,7 +7313,6 @@
           </w:tcPr>
           <w:p>
             <w:r>
-              <w:lastRenderedPageBreak/>
               <w:t>earqComponenteFormato</w:t>
             </w:r>
           </w:p>
@@ -7307,7 +7355,11 @@
             <w:vAlign w:val="center"/>
             <w:hideMark/>
           </w:tcPr>
-          <w:p/>
+          <w:p>
+            <w:r>
+              <w:t>Metadado Desejável.</w:t>
+            </w:r>
+          </w:p>
         </w:tc>
       </w:tr>
       <w:tr>
@@ -7847,7 +7899,7 @@
     <w:p>
       <w:r>
         <w:pict w14:anchorId="25FE9C95">
-          <v:rect id="_x0000_i1148" style="width:0;height:1.5pt" o:hralign="center" o:hrstd="t" o:hr="t" fillcolor="#a0a0a0" stroked="f"/>
+          <v:rect id="_x0000_i1040" style="width:0;height:1.5pt" o:hralign="center" o:hrstd="t" o:hr="t" fillcolor="#a0a0a0" stroked="f"/>
         </w:pict>
       </w:r>
     </w:p>
@@ -7857,6 +7909,7 @@
       </w:pPr>
       <w:bookmarkStart w:id="21" w:name="_Toc219363607"/>
       <w:r>
+        <w:lastRenderedPageBreak/>
         <w:t>4.13 documento_schema.json — Documento</w:t>
       </w:r>
       <w:bookmarkEnd w:id="21"/>
@@ -7879,7 +7932,6 @@
           <w:b/>
           <w:bCs/>
         </w:rPr>
-        <w:lastRenderedPageBreak/>
         <w:t>Campos principais (seleção, por relevância):</w:t>
       </w:r>
     </w:p>
@@ -8527,6 +8579,7 @@
           </w:tcPr>
           <w:p>
             <w:r>
+              <w:lastRenderedPageBreak/>
               <w:t>earqProcessoDossieId</w:t>
             </w:r>
           </w:p>
@@ -8588,7 +8641,6 @@
           </w:tcPr>
           <w:p>
             <w:r>
-              <w:lastRenderedPageBreak/>
               <w:t>earqVolumeId</w:t>
             </w:r>
           </w:p>
@@ -9467,6 +9519,7 @@
           </w:tcPr>
           <w:p>
             <w:r>
+              <w:lastRenderedPageBreak/>
               <w:t>earqDocumentoSequencia</w:t>
             </w:r>
           </w:p>
@@ -9589,7 +9642,6 @@
           </w:tcPr>
           <w:p>
             <w:r>
-              <w:lastRenderedPageBreak/>
               <w:t>earqDocumentoPrevisaoDesclassificacao</w:t>
             </w:r>
           </w:p>
@@ -10206,6 +10258,7 @@
         <w:rPr>
           <w:rFonts w:ascii="Segoe UI Emoji" w:hAnsi="Segoe UI Emoji" w:cs="Segoe UI Emoji"/>
         </w:rPr>
+        <w:lastRenderedPageBreak/>
         <w:t>⚠️</w:t>
       </w:r>
       <w:r>
@@ -10253,7 +10306,6 @@
         <w:rPr>
           <w:color w:val="EE0000"/>
         </w:rPr>
-        <w:lastRenderedPageBreak/>
         <w:t>earqDocumentoPrevisaoDesclassificacao</w:t>
       </w:r>
       <w:r>
@@ -10342,10 +10394,7 @@
         <w:t xml:space="preserve">: </w:t>
       </w:r>
       <w:r>
-        <w:t>Não é obrigatório no padrão, apesar de ser no e-arq brasil, para o caso do uso do padrão ser tramite externo,</w:t>
-      </w:r>
-      <w:r>
-        <w:t xml:space="preserve"> neste caso o órgão receptor do tramite é quem define o setor de execução</w:t>
+        <w:t>Não é obrigatório no padrão, apesar de ser no e-arq brasil, para o caso do uso do padrão ser tramite externo, neste caso o órgão receptor do tramite é quem define o setor de execução</w:t>
       </w:r>
     </w:p>
     <w:p>
@@ -10364,7 +10413,7 @@
     <w:p>
       <w:r>
         <w:pict w14:anchorId="33C9C2E4">
-          <v:rect id="_x0000_i1149" style="width:0;height:1.5pt" o:hralign="center" o:hrstd="t" o:hr="t" fillcolor="#a0a0a0" stroked="f"/>
+          <v:rect id="_x0000_i1041" style="width:0;height:1.5pt" o:hralign="center" o:hrstd="t" o:hr="t" fillcolor="#a0a0a0" stroked="f"/>
         </w:pict>
       </w:r>
     </w:p>
@@ -10474,13 +10523,14 @@
     </w:p>
     <w:p>
       <w:r>
+        <w:lastRenderedPageBreak/>
         <w:t>Como os schemas ainda estão em desenvolvimento e com inconsistências de nomenclatura, recomendo usar este exemplo como “guia de preenchimento” e só depois ajustar para validação estrita quando os nomes/cases forem estabilizados.</w:t>
       </w:r>
     </w:p>
     <w:p>
       <w:r>
         <w:pict w14:anchorId="5E467899">
-          <v:rect id="_x0000_i1150" style="width:0;height:1.5pt" o:hralign="center" o:hrstd="t" o:hr="t" fillcolor="#a0a0a0" stroked="f"/>
+          <v:rect id="_x0000_i1042" style="width:0;height:1.5pt" o:hralign="center" o:hrstd="t" o:hr="t" fillcolor="#a0a0a0" stroked="f"/>
         </w:pict>
       </w:r>
     </w:p>
@@ -10490,7 +10540,6 @@
       </w:pPr>
       <w:bookmarkStart w:id="24" w:name="_Toc219363610"/>
       <w:r>
-        <w:lastRenderedPageBreak/>
         <w:t>6) Checklist de implementação (para quem vai produzir/consumir JSON)</w:t>
       </w:r>
       <w:bookmarkEnd w:id="24"/>
@@ -12553,6 +12602,7 @@
   <w:style w:type="character" w:default="1" w:styleId="Fontepargpadro">
     <w:name w:val="Default Paragraph Font"/>
     <w:uiPriority w:val="1"/>
+    <w:semiHidden/>
     <w:unhideWhenUsed/>
   </w:style>
   <w:style w:type="table" w:default="1" w:styleId="Tabelanormal">

</xml_diff>